<commit_message>
naht glätten - fix speed
</commit_message>
<xml_diff>
--- a/doc/features_en.docx
+++ b/doc/features_en.docx
@@ -232,6 +232,14 @@
       </w:pPr>
       <w:r>
         <w:t>Fetch elevation data from Mapbox</w:t>
+      </w:r>
+    </w:p>
+    <w:p>
+      <w:pPr>
+        <w:pStyle w:val="Aufzhlungszeichen"/>
+      </w:pPr>
+      <w:r>
+        <w:t xml:space="preserve">Fix speed spike at a cut seam (missing riding time after a camera failure)</w:t>
       </w:r>
     </w:p>
     <w:p>

</xml_diff>

<commit_message>
Doppelklick Höhenprofilfix und Handbuch
</commit_message>
<xml_diff>
--- a/doc/features_en.docx
+++ b/doc/features_en.docx
@@ -135,6 +135,14 @@
         <w:pStyle w:val="Aufzhlungszeichen"/>
       </w:pPr>
       <w:r>
+        <w:t xml:space="preserve">Undo history (Edit menu): every step with a name and time, undo back to any of them</w:t>
+      </w:r>
+    </w:p>
+    <w:p>
+      <w:pPr>
+        <w:pStyle w:val="Aufzhlungszeichen"/>
+      </w:pPr>
+      <w:r>
         <w:t xml:space="preserve">Thumbnails in the timeline (optional): single frames of the video drawn along the timeline, so a cut can be placed by the picture</w:t>
       </w:r>
     </w:p>
@@ -231,7 +239,7 @@
         <w:pStyle w:val="Aufzhlungszeichen"/>
       </w:pPr>
       <w:r>
-        <w:t>Fetch elevation data from Mapbox</w:t>
+        <w:t>Fetch elevation data from Mapbox (interpolated between the pixels)</w:t>
       </w:r>
     </w:p>
     <w:p>
@@ -240,6 +248,38 @@
       </w:pPr>
       <w:r>
         <w:t xml:space="preserve">Fix speed spike at a cut seam (missing riding time after a camera failure)</w:t>
+      </w:r>
+    </w:p>
+    <w:p>
+      <w:pPr>
+        <w:pStyle w:val="Aufzhlungszeichen"/>
+      </w:pPr>
+      <w:r>
+        <w:t xml:space="preserve">Cut GPX to video (B..E): after a camera failure, remove exactly the GPX time that puts a chosen point back on the video time</w:t>
+      </w:r>
+    </w:p>
+    <w:p>
+      <w:pPr>
+        <w:pStyle w:val="Aufzhlungszeichen"/>
+      </w:pPr>
+      <w:r>
+        <w:t xml:space="preserve">Height profile editor (B..E): rebuild the heights of a section by hand - support points, grades, rounding per point, video position in the profile</w:t>
+      </w:r>
+    </w:p>
+    <w:p>
+      <w:pPr>
+        <w:pStyle w:val="Aufzhlungszeichen"/>
+      </w:pPr>
+      <w:r>
+        <w:t xml:space="preserve">Smooth a marked range only; warning when the track was already smoothed, climb before and after</w:t>
+      </w:r>
+    </w:p>
+    <w:p>
+      <w:pPr>
+        <w:pStyle w:val="Aufzhlungszeichen"/>
+      </w:pPr>
+      <w:r>
+        <w:t xml:space="preserve">Right-click markB / markE: re-select the gap of the last cut</w:t>
       </w:r>
     </w:p>
     <w:p>

</xml_diff>